<commit_message>
Introduzione opzioni file stampa badge
</commit_message>
<xml_diff>
--- a/Backend/src/main/resources/MULTIPLO.docx
+++ b/Backend/src/main/resources/MULTIPLO.docx
@@ -1317,8 +1317,28 @@
         <w:sz w:val="18"/>
         <w:szCs w:val="18"/>
       </w:rPr>
-      <w:t>PEC: ril.digitalizzazione@cert.vigilfuoco.it</w:t>
+      <w:t xml:space="preserve">PEC: </w:t>
     </w:r>
+    <w:hyperlink r:id="rId1" w:history="1">
+      <w:r>
+        <w:rPr>
+          <w:rStyle w:val="Collegamentoipertestuale"/>
+          <w:sz w:val="18"/>
+          <w:szCs w:val="18"/>
+        </w:rPr>
+        <w:t>ril.digitalizzazione@cert.vigilfuoco.it</w:t>
+      </w:r>
+    </w:hyperlink>
+  </w:p>
+  <w:p>
+    <w:pPr>
+      <w:spacing w:line="276" w:lineRule="auto"/>
+      <w:jc w:val="center"/>
+      <w:rPr>
+        <w:sz w:val="18"/>
+        <w:szCs w:val="18"/>
+      </w:rPr>
+    </w:pPr>
   </w:p>
   <w:p>
     <w:pPr>
@@ -1384,7 +1404,7 @@
                   <a:blip r:embed="rId1">
                     <a:extLst>
                       <a:ext uri="{28A0092B-C50C-407E-A947-70E740481C1C}">
-                        <a14:useLocalDpi xmlns:a14="http://schemas.microsoft.com/office/drawing/2010/main" xmlns:wps="http://schemas.microsoft.com/office/word/2010/wordprocessingShape" xmlns:wpi="http://schemas.microsoft.com/office/word/2010/wordprocessingInk" xmlns:wpg="http://schemas.microsoft.com/office/word/2010/wordprocessingGroup" xmlns:w15="http://schemas.microsoft.com/office/word/2012/wordml" xmlns:w14="http://schemas.microsoft.com/office/word/2010/wordml" xmlns:w="http://schemas.openxmlformats.org/wordprocessingml/2006/main" xmlns:w10="urn:schemas-microsoft-com:office:word" xmlns:wp14="http://schemas.microsoft.com/office/word/2010/wordprocessingDrawing" xmlns:v="urn:schemas-microsoft-com:vml" xmlns:o="urn:schemas-microsoft-com:office:office" xmlns:mc="http://schemas.openxmlformats.org/markup-compatibility/2006" xmlns:wpc="http://schemas.microsoft.com/office/word/2010/wordprocessingCanvas" xmlns="" val="0"/>
+                        <a14:useLocalDpi xmlns="" xmlns:wpc="http://schemas.microsoft.com/office/word/2010/wordprocessingCanvas" xmlns:mc="http://schemas.openxmlformats.org/markup-compatibility/2006" xmlns:o="urn:schemas-microsoft-com:office:office" xmlns:v="urn:schemas-microsoft-com:vml" xmlns:wp14="http://schemas.microsoft.com/office/word/2010/wordprocessingDrawing" xmlns:w10="urn:schemas-microsoft-com:office:word" xmlns:w="http://schemas.openxmlformats.org/wordprocessingml/2006/main" xmlns:w14="http://schemas.microsoft.com/office/word/2010/wordml" xmlns:w15="http://schemas.microsoft.com/office/word/2012/wordml" xmlns:wpg="http://schemas.microsoft.com/office/word/2010/wordprocessingGroup" xmlns:wpi="http://schemas.microsoft.com/office/word/2010/wordprocessingInk" xmlns:wps="http://schemas.microsoft.com/office/word/2010/wordprocessingShape" xmlns:a14="http://schemas.microsoft.com/office/drawing/2010/main" val="0"/>
                       </a:ext>
                     </a:extLst>
                   </a:blip>

</xml_diff>